<commit_message>
auto: session 2026-07-11 13:28
Co-Authored-By: Claude Opus 4.8 (1M context) <noreply@anthropic.com>
</commit_message>
<xml_diff>
--- a/bai-pr/2026/07/02-baodanang-xu-huong-ai-dich-vu-so.docx
+++ b/bai-pr/2026/07/02-baodanang-xu-huong-ai-dich-vu-so.docx
@@ -7,7 +7,7 @@
         <w:pStyle w:val="Heading1"/>
       </w:pPr>
       <w:r>
-        <w:t xml:space="preserve">DigicomVN và xu hướng booking báo chí, automation truyền thông ứng dụng AI cho doanh nghiệp Việt</w:t>
+        <w:t xml:space="preserve">DigicomVN giải thích book báo là gì và cách chọn agency book báo phù hợp</w:t>
       </w:r>
     </w:p>
     <w:p>
@@ -20,7 +20,7 @@
           <w:b/>
           <w:bCs/>
         </w:rPr>
-        <w:t xml:space="preserve">Trong bối cảnh người dùng ngày càng hỏi trực tiếp các công cụ tìm kiếm AI thay vì gõ từ khoá, DigicomVN tập trung vào dịch vụ booking báo chí kết hợp automation, giúp thương hiệu doanh nghiệp được nhận diện tốt hơn trên cả Google lẫn công cụ tìm kiếm AI. Câu chuyện của ICD Việt Nam cho thấy hiệu quả thực tế của mô hình này.</w:t>
+        <w:t xml:space="preserve">Nhiều doanh nghiệp tra cứu “book báo là gì”, “giá book báo” hay “agency book báo” nhưng chưa rõ nên bắt đầu từ đâu. DigicomVN giải thích quy trình book báo chí và chia sẻ kinh nghiệm chọn agency phù hợp, dựa trên câu chuyện thực tế của ICD Việt Nam.</w:t>
       </w:r>
     </w:p>
     <w:p>
@@ -86,23 +86,75 @@
     </w:p>
     <w:p>
       <w:pPr>
+        <w:spacing w:after="200"/>
+        <w:jc w:val="both"/>
+      </w:pPr>
+      <w:r>
+        <w:rPr>
+          <w:b w:val="false"/>
+          <w:bCs w:val="false"/>
+        </w:rPr>
+        <w:t xml:space="preserve">“Book báo” là cách gọi phổ biến trong giới marketing cho việc đặt lịch đăng bài PR trên báo điện tử.</w:t>
+      </w:r>
+    </w:p>
+    <w:p>
+      <w:pPr>
+        <w:spacing w:after="200"/>
+        <w:jc w:val="both"/>
+      </w:pPr>
+      <w:r>
+        <w:rPr>
+          <w:b w:val="false"/>
+          <w:bCs w:val="false"/>
+        </w:rPr>
+        <w:t xml:space="preserve">Thuật ngữ chính thức là booking báo chí, nhưng phần lớn doanh nghiệp tìm kiếm bằng cụm “book báo” hoặc “book báo chí” khi cần dịch vụ này.</w:t>
+      </w:r>
+    </w:p>
+    <w:p>
+      <w:pPr>
         <w:pStyle w:val="Heading2"/>
       </w:pPr>
       <w:r>
-        <w:t xml:space="preserve">Xu hướng tìm kiếm dịch chuyển sang AI</w:t>
-      </w:r>
-    </w:p>
-    <w:p>
-      <w:pPr>
-        <w:spacing w:after="200"/>
-        <w:jc w:val="both"/>
-      </w:pPr>
-      <w:r>
-        <w:rPr>
-          <w:b w:val="false"/>
-          <w:bCs w:val="false"/>
-        </w:rPr>
-        <w:t xml:space="preserve">Trí tuệ nhân tạo (AI) không còn là khái niệm xa lạ, nhưng phần lớn doanh nghiệp tại Việt Nam vẫn chưa tận dụng được các tín hiệu giúp thương hiệu xuất hiện tốt hơn trên công cụ tìm kiếm AI.</w:t>
+        <w:t xml:space="preserve">Book báo là gì</w:t>
+      </w:r>
+    </w:p>
+    <w:p>
+      <w:pPr>
+        <w:spacing w:after="200"/>
+        <w:jc w:val="both"/>
+      </w:pPr>
+      <w:r>
+        <w:rPr>
+          <w:b w:val="false"/>
+          <w:bCs w:val="false"/>
+        </w:rPr>
+        <w:t xml:space="preserve">Một bài book báo thường gồm ba yếu tố: nội dung bài viết, đầu báo đăng tải, và vị trí hiển thị trên trang.</w:t>
+      </w:r>
+    </w:p>
+    <w:p>
+      <w:pPr>
+        <w:spacing w:after="200"/>
+        <w:jc w:val="both"/>
+      </w:pPr>
+      <w:r>
+        <w:rPr>
+          <w:b w:val="false"/>
+          <w:bCs w:val="false"/>
+        </w:rPr>
+        <w:t xml:space="preserve">Ngoài ra còn có thời gian bài được lưu trên hệ thống báo đó, yếu tố ảnh hưởng trực tiếp đến hiệu quả lâu dài.</w:t>
+      </w:r>
+    </w:p>
+    <w:p>
+      <w:pPr>
+        <w:spacing w:after="200"/>
+        <w:jc w:val="both"/>
+      </w:pPr>
+      <w:r>
+        <w:rPr>
+          <w:b w:val="false"/>
+          <w:bCs w:val="false"/>
+        </w:rPr>
+        <w:t xml:space="preserve">Nhiều doanh nghiệp tại Đà Nẵng và khu vực miền Trung tìm đến dịch vụ book báo khi muốn thương hiệu xuất hiện trên báo chí uy tín nhưng không có đội ngũ quan hệ báo chí riêng.</w:t>
       </w:r>
     </w:p>
     <w:p>
@@ -128,7 +180,7 @@
           <w:b w:val="false"/>
           <w:bCs w:val="false"/>
         </w:rPr>
-        <w:t xml:space="preserve">Khi ngày càng nhiều người dùng đặt câu hỏi trực tiếp cho ChatGPT, Google AI Overview hay Perplexity thay vì gõ từ khoá tìm kiếm truyền thống, việc thương hiệu được nhắc đến trên các nguồn báo chí uy tín trở thành một tín hiệu quan trọng để các công cụ này nhận diện và trích dẫn doanh nghiệp.</w:t>
+        <w:t xml:space="preserve">Khi người dùng ngày càng hỏi trực tiếp ChatGPT hay Google AI Overview thay vì gõ từ khoá, việc thương hiệu được nhắc trên báo chí trở thành tín hiệu quan trọng để các công cụ này nhận diện doanh nghiệp.</w:t>
       </w:r>
     </w:p>
     <w:p>
@@ -136,46 +188,59 @@
         <w:pStyle w:val="Heading2"/>
       </w:pPr>
       <w:r>
-        <w:t xml:space="preserve">Vì sao báo chí độc lập đáng tin hơn quảng cáo trong mắt AI</w:t>
-      </w:r>
-    </w:p>
-    <w:p>
-      <w:pPr>
-        <w:spacing w:after="200"/>
-        <w:jc w:val="both"/>
-      </w:pPr>
-      <w:r>
-        <w:rPr>
-          <w:b w:val="false"/>
-          <w:bCs w:val="false"/>
-        </w:rPr>
-        <w:t xml:space="preserve">Khác với quảng cáo trả phí, nơi doanh nghiệp tự quyết định nội dung và trả tiền để xuất hiện, một bài viết trên báo chí độc lập đi qua quy trình biên tập của bên thứ ba, nên có độ tin cậy cao hơn trong mắt cả người đọc lẫn các mô hình AI.</w:t>
-      </w:r>
-    </w:p>
-    <w:p>
-      <w:pPr>
-        <w:spacing w:after="200"/>
-        <w:jc w:val="both"/>
-      </w:pPr>
-      <w:r>
-        <w:rPr>
-          <w:b w:val="false"/>
-          <w:bCs w:val="false"/>
-        </w:rPr>
-        <w:t xml:space="preserve">Đây chính là điểm khác biệt cốt lõi giữa một bài quảng cáo và một tín hiệu GEO thực sự: các công cụ tìm kiếm AI ưu tiên trích dẫn những nguồn được nhiều bên độc lập xác nhận, thay vì nguồn do chính doanh nghiệp tự công bố.</w:t>
-      </w:r>
-    </w:p>
-    <w:p>
-      <w:pPr>
-        <w:spacing w:after="200"/>
-        <w:jc w:val="both"/>
-      </w:pPr>
-      <w:r>
-        <w:rPr>
-          <w:b w:val="false"/>
-          <w:bCs w:val="false"/>
-        </w:rPr>
-        <w:t xml:space="preserve">Vì vậy, một chiến dịch booking báo chí hiệu quả không chỉ đơn thuần là đăng càng nhiều bài càng tốt, mà cần được lặp lại đều đặn trên các đầu báo có uy tín để dần hình thành một hồ sơ thông tin nhất quán về doanh nghiệp.</w:t>
+        <w:t xml:space="preserve">Giá book báo phụ thuộc vào điều gì</w:t>
+      </w:r>
+    </w:p>
+    <w:p>
+      <w:pPr>
+        <w:spacing w:after="200"/>
+        <w:jc w:val="both"/>
+      </w:pPr>
+      <w:r>
+        <w:rPr>
+          <w:b w:val="false"/>
+          <w:bCs w:val="false"/>
+        </w:rPr>
+        <w:t xml:space="preserve">Nhiều người tìm “giá book báo” hoặc “bảng giá book báo” với kỳ vọng có một mức giá cố định áp dụng cho mọi đầu báo.</w:t>
+      </w:r>
+    </w:p>
+    <w:p>
+      <w:pPr>
+        <w:spacing w:after="200"/>
+        <w:jc w:val="both"/>
+      </w:pPr>
+      <w:r>
+        <w:rPr>
+          <w:b w:val="false"/>
+          <w:bCs w:val="false"/>
+        </w:rPr>
+        <w:t xml:space="preserve">Trên thực tế, giá không cố định vì phụ thuộc vào lượng truy cập, vị trí chuyên mục và thời gian bài được giữ trên hệ thống của từng báo.</w:t>
+      </w:r>
+    </w:p>
+    <w:p>
+      <w:pPr>
+        <w:spacing w:after="200"/>
+        <w:jc w:val="both"/>
+      </w:pPr>
+      <w:r>
+        <w:rPr>
+          <w:b w:val="false"/>
+          <w:bCs w:val="false"/>
+        </w:rPr>
+        <w:t xml:space="preserve">Ngoài chi phí đăng bài, phần ít được nhắc đến là công sức duy trì quan hệ với từng đầu báo: liên hệ, gửi nội dung đúng định dạng, theo dõi lịch đăng.</w:t>
+      </w:r>
+    </w:p>
+    <w:p>
+      <w:pPr>
+        <w:spacing w:after="200"/>
+        <w:jc w:val="both"/>
+      </w:pPr>
+      <w:r>
+        <w:rPr>
+          <w:b w:val="false"/>
+          <w:bCs w:val="false"/>
+        </w:rPr>
+        <w:t xml:space="preserve">Đây là lý do nhiều doanh nghiệp sau một thời gian tự book báo nhận ra phần chi phí thực sự nằm ở nhân sự vận hành, không chỉ ở tiền trả cho tòa soạn.</w:t>
       </w:r>
     </w:p>
     <w:p>
@@ -183,15 +248,41 @@
         <w:pStyle w:val="Heading2"/>
       </w:pPr>
       <w:r>
-        <w:t xml:space="preserve">DigicomVN và hướng đi tập trung vào booking báo chí</w:t>
-      </w:r>
-    </w:p>
-    <w:p>
-      <w:pPr>
-        <w:spacing w:after="200"/>
-        <w:jc w:val="both"/>
-      </w:pPr>
-      <w:hyperlink w:history="1" r:id="rIdcnq_shrw4j4r85q5usbsp">
+        <w:t xml:space="preserve">Tự làm hay thuê agency book báo</w:t>
+      </w:r>
+    </w:p>
+    <w:p>
+      <w:pPr>
+        <w:spacing w:after="200"/>
+        <w:jc w:val="both"/>
+      </w:pPr>
+      <w:r>
+        <w:rPr>
+          <w:b w:val="false"/>
+          <w:bCs w:val="false"/>
+        </w:rPr>
+        <w:t xml:space="preserve">Với doanh nghiệp chỉ cần đăng một vài bài, tự liên hệ trực tiếp từng báo vẫn khả thi.</w:t>
+      </w:r>
+    </w:p>
+    <w:p>
+      <w:pPr>
+        <w:spacing w:after="200"/>
+        <w:jc w:val="both"/>
+      </w:pPr>
+      <w:r>
+        <w:rPr>
+          <w:b w:val="false"/>
+          <w:bCs w:val="false"/>
+        </w:rPr>
+        <w:t xml:space="preserve">Nhưng khi cần duy trì tần suất đều đặn trên nhiều đầu báo, thuê một agency book báo chuyên nghiệp thường tiết kiệm thời gian hơn.</w:t>
+      </w:r>
+    </w:p>
+    <w:p>
+      <w:pPr>
+        <w:spacing w:after="200"/>
+        <w:jc w:val="both"/>
+      </w:pPr>
+      <w:hyperlink w:history="1" r:id="rIde8iudvrdf9m8a78zpzfnt">
         <w:r>
           <w:rPr>
             <w:rStyle w:val="Hyperlink"/>
@@ -206,59 +297,7 @@
           <w:b w:val="false"/>
           <w:bCs w:val="false"/>
         </w:rPr>
-        <w:t xml:space="preserve"> là một trong số ít đơn vị tại Việt Nam tập trung vào dịch vụ truyền thông theo hướng này: booking báo chí, PR kết hợp automation ứng dụng AI, thay vì cung cấp một danh mục dịch vụ dàn trải.</w:t>
-      </w:r>
-    </w:p>
-    <w:p>
-      <w:pPr>
-        <w:spacing w:after="200"/>
-        <w:jc w:val="both"/>
-      </w:pPr>
-      <w:r>
-        <w:rPr>
-          <w:b w:val="false"/>
-          <w:bCs w:val="false"/>
-        </w:rPr>
-        <w:t xml:space="preserve">Mục tiêu là giúp doanh nghiệp tiết kiệm nhân sự, chi phí vận hành trong khi vẫn xây dựng được hiện diện thương hiệu bài bản trên báo chí.</w:t>
-      </w:r>
-    </w:p>
-    <w:p>
-      <w:pPr>
-        <w:spacing w:after="200"/>
-        <w:jc w:val="both"/>
-      </w:pPr>
-      <w:r>
-        <w:rPr>
-          <w:b w:val="false"/>
-          <w:bCs w:val="false"/>
-        </w:rPr>
-        <w:t xml:space="preserve">Ông Đỗ Xuân Hiếu, Giám đốc DigicomVN (CÔNG TY TNHH DỊCH VỤ TRUYỀN THÔNG DIGITO COMBAT), người có gần 15 năm kinh nghiệm trong lĩnh vực truyền thông và marketing, cho biết booking báo chí trước đây chủ yếu phục vụ mục đích quảng bá thương hiệu tới độc giả.</w:t>
-      </w:r>
-    </w:p>
-    <w:p>
-      <w:pPr>
-        <w:spacing w:after="200"/>
-        <w:jc w:val="both"/>
-      </w:pPr>
-      <w:r>
-        <w:rPr>
-          <w:b w:val="false"/>
-          <w:bCs w:val="false"/>
-        </w:rPr>
-        <w:t xml:space="preserve">Theo ông, vai trò này đang mở rộng thêm một lớp giá trị mới: định danh doanh nghiệp trên các công cụ tìm kiếm AI.</w:t>
-      </w:r>
-    </w:p>
-    <w:p>
-      <w:pPr>
-        <w:spacing w:after="200"/>
-        <w:jc w:val="both"/>
-      </w:pPr>
-      <w:r>
-        <w:rPr>
-          <w:b w:val="false"/>
-          <w:bCs w:val="false"/>
-        </w:rPr>
-        <w:t xml:space="preserve">Một ví dụ cụ thể được ông Hiếu chia sẻ là quy trình automation tại DigicomVN cho khâu booking báo chí: thay vì phải liên hệ thủ công từng đầu báo, hệ thống hỗ trợ lên lịch đăng bài, theo dõi tiến độ và tổng hợp báo cáo hiệu quả tự động.</w:t>
+        <w:t xml:space="preserve"> là một trong những đơn vị cung cấp dịch vụ book báo chí và PR tại Việt Nam, kết hợp automation ứng dụng AI để giảm bớt phần việc thủ công cho khách hàng.</w:t>
       </w:r>
     </w:p>
     <w:p>
@@ -266,22 +305,56 @@
         <w:pStyle w:val="Heading2"/>
       </w:pPr>
       <w:r>
-        <w:t xml:space="preserve">Khách hàng thực tế: ICD Việt Nam</w:t>
-      </w:r>
-    </w:p>
-    <w:p>
-      <w:pPr>
-        <w:spacing w:after="200"/>
-        <w:jc w:val="both"/>
-      </w:pPr>
-      <w:r>
-        <w:rPr>
-          <w:b w:val="false"/>
-          <w:bCs w:val="false"/>
-        </w:rPr>
-        <w:t xml:space="preserve">Một khách hàng đang sử dụng dịch vụ của DigicomVN là </w:t>
-      </w:r>
-      <w:hyperlink w:history="1" r:id="rId61sd_e3zwyrtoutm65qba">
+        <w:t xml:space="preserve">Cách DigicomVN ứng dụng AI vào book báo</w:t>
+      </w:r>
+    </w:p>
+    <w:p>
+      <w:pPr>
+        <w:spacing w:after="200"/>
+        <w:jc w:val="both"/>
+      </w:pPr>
+      <w:r>
+        <w:rPr>
+          <w:b w:val="false"/>
+          <w:bCs w:val="false"/>
+        </w:rPr>
+        <w:t xml:space="preserve">Ông Đỗ Xuân Hiếu, Giám đốc DigicomVN (CÔNG TY TNHH DỊCH VỤ TRUYỀN THÔNG DIGITO COMBAT), cho biết hệ thống automation của công ty hỗ trợ lên lịch book báo, theo dõi tiến độ đăng bài và tổng hợp báo cáo hiệu quả tự động.</w:t>
+      </w:r>
+    </w:p>
+    <w:p>
+      <w:pPr>
+        <w:spacing w:after="200"/>
+        <w:jc w:val="both"/>
+      </w:pPr>
+      <w:r>
+        <w:rPr>
+          <w:b w:val="false"/>
+          <w:bCs w:val="false"/>
+        </w:rPr>
+        <w:t xml:space="preserve">Theo ông, một chiến dịch book báo hiệu quả không nằm ở số lượng bài đăng, mà ở việc chọn đúng đầu báo phù hợp với ngành hàng và duy trì tần suất đều đặn theo thời gian.</w:t>
+      </w:r>
+    </w:p>
+    <w:p>
+      <w:pPr>
+        <w:pStyle w:val="Heading2"/>
+      </w:pPr>
+      <w:r>
+        <w:t xml:space="preserve">Câu chuyện thực tế: ICD Việt Nam</w:t>
+      </w:r>
+    </w:p>
+    <w:p>
+      <w:pPr>
+        <w:spacing w:after="200"/>
+        <w:jc w:val="both"/>
+      </w:pPr>
+      <w:r>
+        <w:rPr>
+          <w:b w:val="false"/>
+          <w:bCs w:val="false"/>
+        </w:rPr>
+        <w:t xml:space="preserve">Một khách hàng đang sử dụng dịch vụ book báo của DigicomVN là </w:t>
+      </w:r>
+      <w:hyperlink w:history="1" r:id="rId5-x3jnfsjlp2wlxpv8m1k">
         <w:r>
           <w:rPr>
             <w:rStyle w:val="Hyperlink"/>
@@ -296,46 +369,20 @@
           <w:b w:val="false"/>
           <w:bCs w:val="false"/>
         </w:rPr>
-        <w:t xml:space="preserve">, doanh nghiệp trong lĩnh vực vật tư đóng gói công nghiệp.</w:t>
-      </w:r>
-    </w:p>
-    <w:p>
-      <w:pPr>
-        <w:spacing w:after="200"/>
-        <w:jc w:val="both"/>
-      </w:pPr>
-      <w:r>
-        <w:rPr>
-          <w:b w:val="false"/>
-          <w:bCs w:val="false"/>
-        </w:rPr>
-        <w:t xml:space="preserve">Ông Lê Văn Thăng, Giám đốc ICD Việt Nam, nhận xét việc được DigicomVN hỗ trợ booking báo chí đều đặn giúp thương hiệu ICD Việt Nam xuất hiện nhiều hơn trên các kênh báo chí uy tín.</w:t>
-      </w:r>
-    </w:p>
-    <w:p>
-      <w:pPr>
-        <w:spacing w:after="200"/>
-        <w:jc w:val="both"/>
-      </w:pPr>
-      <w:r>
-        <w:rPr>
-          <w:b w:val="false"/>
-          <w:bCs w:val="false"/>
-        </w:rPr>
-        <w:t xml:space="preserve">Ông Thăng cho biết thêm, điều khiến ICD Việt Nam yên tâm hợp tác lâu dài là cách DigicomVN trình bày dữ liệu cụ thể sau mỗi đợt booking báo, thay vì chỉ báo cáo chung chung.</w:t>
-      </w:r>
-    </w:p>
-    <w:p>
-      <w:pPr>
-        <w:spacing w:after="200"/>
-        <w:jc w:val="both"/>
-      </w:pPr>
-      <w:r>
-        <w:rPr>
-          <w:b w:val="false"/>
-          <w:bCs w:val="false"/>
-        </w:rPr>
-        <w:t xml:space="preserve">Mỗi tháng, đội ngũ DigicomVN đều có báo cáo cụ thể về số lượng bài đăng và các đầu báo đã triển khai.</w:t>
+        <w:t xml:space="preserve">, doanh nghiệp vật tư đóng gói công nghiệp.</w:t>
+      </w:r>
+    </w:p>
+    <w:p>
+      <w:pPr>
+        <w:spacing w:after="200"/>
+        <w:jc w:val="both"/>
+      </w:pPr>
+      <w:r>
+        <w:rPr>
+          <w:b w:val="false"/>
+          <w:bCs w:val="false"/>
+        </w:rPr>
+        <w:t xml:space="preserve">Ông Lê Văn Thăng, Giám đốc ICD Việt Nam, cho biết trước đây doanh nghiệp từng tự liên hệ một vài đầu báo nhưng không duy trì được đều đặn vì thiếu nhân sự.</w:t>
       </w:r>
     </w:p>
     <w:p>
@@ -401,96 +448,75 @@
     </w:p>
     <w:p>
       <w:pPr>
+        <w:spacing w:after="200"/>
+        <w:jc w:val="both"/>
+      </w:pPr>
+      <w:r>
+        <w:rPr>
+          <w:b w:val="false"/>
+          <w:bCs w:val="false"/>
+        </w:rPr>
+        <w:t xml:space="preserve">Từ khi sử dụng dịch vụ của DigicomVN, lịch book báo được theo dõi tự động và ông nhận báo cáo cụ thể sau mỗi đợt đăng bài.</w:t>
+      </w:r>
+    </w:p>
+    <w:p>
+      <w:pPr>
         <w:pStyle w:val="Heading2"/>
       </w:pPr>
       <w:r>
-        <w:t xml:space="preserve">Cơ hội tại Đà Nẵng và khu vực miền Trung</w:t>
-      </w:r>
-    </w:p>
-    <w:p>
-      <w:pPr>
-        <w:spacing w:after="200"/>
-        <w:jc w:val="both"/>
-      </w:pPr>
-      <w:r>
-        <w:rPr>
-          <w:b w:val="false"/>
-          <w:bCs w:val="false"/>
-        </w:rPr>
-        <w:t xml:space="preserve">Đà Nẵng và khu vực miền Trung những năm gần đây là điểm đến của nhiều doanh nghiệp khởi nghiệp trong các lĩnh vực sản xuất, dịch vụ và công nghệ.</w:t>
-      </w:r>
-    </w:p>
-    <w:p>
-      <w:pPr>
-        <w:spacing w:after="200"/>
-        <w:jc w:val="both"/>
-      </w:pPr>
-      <w:r>
-        <w:rPr>
-          <w:b w:val="false"/>
-          <w:bCs w:val="false"/>
-        </w:rPr>
-        <w:t xml:space="preserve">Đây cũng là môi trường mà các đơn vị tập trung vào dịch vụ truyền thông và automation như DigicomVN có nhiều cơ hội hợp tác, khi doanh nghiệp cần xây dựng thương hiệu nhanh nhưng chưa có đội ngũ marketing đầy đủ.</w:t>
-      </w:r>
-    </w:p>
-    <w:p>
-      <w:pPr>
-        <w:spacing w:after="200"/>
-        <w:jc w:val="both"/>
-      </w:pPr>
-      <w:r>
-        <w:rPr>
-          <w:b w:val="false"/>
-          <w:bCs w:val="false"/>
-        </w:rPr>
-        <w:t xml:space="preserve">Theo ông Hiếu, một chiến dịch booking báo chí hiệu quả cần chọn đúng đầu báo phù hợp với ngành hàng và đối tượng khách hàng, thay vì đăng tràn lan trên nhiều báo không liên quan.</w:t>
-      </w:r>
-    </w:p>
-    <w:p>
-      <w:pPr>
-        <w:spacing w:after="200"/>
-        <w:jc w:val="both"/>
-      </w:pPr>
-      <w:r>
-        <w:rPr>
-          <w:b w:val="false"/>
-          <w:bCs w:val="false"/>
-        </w:rPr>
-        <w:t xml:space="preserve">Đây cũng là lý do DigicomVN luôn dành thời gian tìm hiểu định hướng thương hiệu của khách hàng trước khi lên kế hoạch booking báo.</w:t>
-      </w:r>
-    </w:p>
-    <w:p>
-      <w:pPr>
-        <w:pStyle w:val="Heading2"/>
-      </w:pPr>
-      <w:r>
-        <w:t xml:space="preserve">Định hướng mở rộng</w:t>
-      </w:r>
-    </w:p>
-    <w:p>
-      <w:pPr>
-        <w:spacing w:after="200"/>
-        <w:jc w:val="both"/>
-      </w:pPr>
-      <w:r>
-        <w:rPr>
-          <w:b w:val="false"/>
-          <w:bCs w:val="false"/>
-        </w:rPr>
-        <w:t xml:space="preserve">Trong bối cảnh công cụ tìm kiếm AI ngày càng phổ biến, việc kết hợp booking báo chí với automation không chỉ giúp tiết kiệm chi phí vận hành mà còn hỗ trợ doanh nghiệp cải thiện khả năng được nhận diện trên cả Google lẫn các nền tảng tìm kiếm AI.</w:t>
-      </w:r>
-    </w:p>
-    <w:p>
-      <w:pPr>
-        <w:spacing w:after="200"/>
-        <w:jc w:val="both"/>
-      </w:pPr>
-      <w:r>
-        <w:rPr>
-          <w:b w:val="false"/>
-          <w:bCs w:val="false"/>
-        </w:rPr>
-        <w:t xml:space="preserve">DigicomVN kỳ vọng sẽ tiếp tục mở rộng tệp khách hàng doanh nghiệp tại nhiều tỉnh thành trên cả nước với định hướng này.</w:t>
+        <w:t xml:space="preserve">Lưu ý khi chọn agency book báo</w:t>
+      </w:r>
+    </w:p>
+    <w:p>
+      <w:pPr>
+        <w:spacing w:after="200"/>
+        <w:jc w:val="both"/>
+      </w:pPr>
+      <w:r>
+        <w:rPr>
+          <w:b w:val="false"/>
+          <w:bCs w:val="false"/>
+        </w:rPr>
+        <w:t xml:space="preserve">Đà Nẵng và khu vực miền Trung có nhiều doanh nghiệp khởi nghiệp trong sản xuất, dịch vụ và công nghệ, nhưng phần lớn chưa có đội ngũ marketing đầy đủ.</w:t>
+      </w:r>
+    </w:p>
+    <w:p>
+      <w:pPr>
+        <w:spacing w:after="200"/>
+        <w:jc w:val="both"/>
+      </w:pPr>
+      <w:r>
+        <w:rPr>
+          <w:b w:val="false"/>
+          <w:bCs w:val="false"/>
+        </w:rPr>
+        <w:t xml:space="preserve">Theo ông Hiếu, khi chọn agency book báo, doanh nghiệp nên hỏi rõ danh sách đầu báo hợp tác thực tế và cách báo cáo hiệu quả sau mỗi đợt đăng.</w:t>
+      </w:r>
+    </w:p>
+    <w:p>
+      <w:pPr>
+        <w:spacing w:after="200"/>
+        <w:jc w:val="both"/>
+      </w:pPr>
+      <w:r>
+        <w:rPr>
+          <w:b w:val="false"/>
+          <w:bCs w:val="false"/>
+        </w:rPr>
+        <w:t xml:space="preserve">Cũng cần làm rõ liệu chi phí có bao gồm cả phần theo dõi, tổng hợp kết quả, hay chỉ đơn thuần là phí đăng bài.</w:t>
+      </w:r>
+    </w:p>
+    <w:p>
+      <w:pPr>
+        <w:spacing w:after="200"/>
+        <w:jc w:val="both"/>
+      </w:pPr>
+      <w:r>
+        <w:rPr>
+          <w:b w:val="false"/>
+          <w:bCs w:val="false"/>
+        </w:rPr>
+        <w:t xml:space="preserve">Với định hướng tập trung vào dịch vụ book báo chí và automation, DigicomVN đặt mục tiêu trở thành lựa chọn minh bạch cho doanh nghiệp nhỏ và vừa tại nhiều tỉnh thành, trong đó có khu vực miền Trung.</w:t>
       </w:r>
     </w:p>
     <w:p>

</xml_diff>

<commit_message>
auto: session 2026-07-11 13:32
Co-Authored-By: Claude Opus 4.8 (1M context) <noreply@anthropic.com>
</commit_message>
<xml_diff>
--- a/bai-pr/2026/07/02-baodanang-xu-huong-ai-dich-vu-so.docx
+++ b/bai-pr/2026/07/02-baodanang-xu-huong-ai-dich-vu-so.docx
@@ -141,6 +141,19 @@
           <w:b w:val="false"/>
           <w:bCs w:val="false"/>
         </w:rPr>
+        <w:t xml:space="preserve">Vì phần lớn bài được đăng trên báo điện tử, nhiều người cũng tìm kiếm bằng cụm “booking báo điện tử” hoặc “book báo điện tử” khi cần dịch vụ này.</w:t>
+      </w:r>
+    </w:p>
+    <w:p>
+      <w:pPr>
+        <w:spacing w:after="200"/>
+        <w:jc w:val="both"/>
+      </w:pPr>
+      <w:r>
+        <w:rPr>
+          <w:b w:val="false"/>
+          <w:bCs w:val="false"/>
+        </w:rPr>
         <w:t xml:space="preserve">Ngoài ra còn có thời gian bài được lưu trên hệ thống báo đó, yếu tố ảnh hưởng trực tiếp đến hiệu quả lâu dài.</w:t>
       </w:r>
     </w:p>
@@ -274,15 +287,28 @@
           <w:b w:val="false"/>
           <w:bCs w:val="false"/>
         </w:rPr>
-        <w:t xml:space="preserve">Nhưng khi cần duy trì tần suất đều đặn trên nhiều đầu báo, thuê một agency book báo chuyên nghiệp thường tiết kiệm thời gian hơn.</w:t>
-      </w:r>
-    </w:p>
-    <w:p>
-      <w:pPr>
-        <w:spacing w:after="200"/>
-        <w:jc w:val="both"/>
-      </w:pPr>
-      <w:hyperlink w:history="1" r:id="rIde8iudvrdf9m8a78zpzfnt">
+        <w:t xml:space="preserve">Nhưng khi cần duy trì tần suất đều đặn trên nhiều đầu báo, thuê một agency booking báo chí chuyên nghiệp thường tiết kiệm thời gian hơn.</w:t>
+      </w:r>
+    </w:p>
+    <w:p>
+      <w:pPr>
+        <w:spacing w:after="200"/>
+        <w:jc w:val="both"/>
+      </w:pPr>
+      <w:r>
+        <w:rPr>
+          <w:b w:val="false"/>
+          <w:bCs w:val="false"/>
+        </w:rPr>
+        <w:t xml:space="preserve">Một số doanh nghiệp cũng tìm “booking báo online” khi muốn đặt lịch đăng bài trực tuyến mà không cần làm việc trực tiếp với từng toà soạn.</w:t>
+      </w:r>
+    </w:p>
+    <w:p>
+      <w:pPr>
+        <w:spacing w:after="200"/>
+        <w:jc w:val="both"/>
+      </w:pPr>
+      <w:hyperlink w:history="1" r:id="rIdsny_qug9mve_ri5oiqtvk">
         <w:r>
           <w:rPr>
             <w:rStyle w:val="Hyperlink"/>
@@ -332,57 +358,6 @@
           <w:bCs w:val="false"/>
         </w:rPr>
         <w:t xml:space="preserve">Theo ông, một chiến dịch book báo hiệu quả không nằm ở số lượng bài đăng, mà ở việc chọn đúng đầu báo phù hợp với ngành hàng và duy trì tần suất đều đặn theo thời gian.</w:t>
-      </w:r>
-    </w:p>
-    <w:p>
-      <w:pPr>
-        <w:pStyle w:val="Heading2"/>
-      </w:pPr>
-      <w:r>
-        <w:t xml:space="preserve">Câu chuyện thực tế: ICD Việt Nam</w:t>
-      </w:r>
-    </w:p>
-    <w:p>
-      <w:pPr>
-        <w:spacing w:after="200"/>
-        <w:jc w:val="both"/>
-      </w:pPr>
-      <w:r>
-        <w:rPr>
-          <w:b w:val="false"/>
-          <w:bCs w:val="false"/>
-        </w:rPr>
-        <w:t xml:space="preserve">Một khách hàng đang sử dụng dịch vụ book báo của DigicomVN là </w:t>
-      </w:r>
-      <w:hyperlink w:history="1" r:id="rId5-x3jnfsjlp2wlxpv8m1k">
-        <w:r>
-          <w:rPr>
-            <w:rStyle w:val="Hyperlink"/>
-            <w:b/>
-            <w:bCs/>
-          </w:rPr>
-          <w:t xml:space="preserve">ICD Việt Nam</w:t>
-        </w:r>
-      </w:hyperlink>
-      <w:r>
-        <w:rPr>
-          <w:b w:val="false"/>
-          <w:bCs w:val="false"/>
-        </w:rPr>
-        <w:t xml:space="preserve">, doanh nghiệp vật tư đóng gói công nghiệp.</w:t>
-      </w:r>
-    </w:p>
-    <w:p>
-      <w:pPr>
-        <w:spacing w:after="200"/>
-        <w:jc w:val="both"/>
-      </w:pPr>
-      <w:r>
-        <w:rPr>
-          <w:b w:val="false"/>
-          <w:bCs w:val="false"/>
-        </w:rPr>
-        <w:t xml:space="preserve">Ông Lê Văn Thăng, Giám đốc ICD Việt Nam, cho biết trước đây doanh nghiệp từng tự liên hệ một vài đầu báo nhưng không duy trì được đều đặn vì thiếu nhân sự.</w:t>
       </w:r>
     </w:p>
     <w:p>
@@ -448,6 +423,57 @@
     </w:p>
     <w:p>
       <w:pPr>
+        <w:pStyle w:val="Heading2"/>
+      </w:pPr>
+      <w:r>
+        <w:t xml:space="preserve">Câu chuyện thực tế: ICD Việt Nam</w:t>
+      </w:r>
+    </w:p>
+    <w:p>
+      <w:pPr>
+        <w:spacing w:after="200"/>
+        <w:jc w:val="both"/>
+      </w:pPr>
+      <w:r>
+        <w:rPr>
+          <w:b w:val="false"/>
+          <w:bCs w:val="false"/>
+        </w:rPr>
+        <w:t xml:space="preserve">Một khách hàng đang sử dụng dịch vụ book báo của DigicomVN là </w:t>
+      </w:r>
+      <w:hyperlink w:history="1" r:id="rIdspag0md6bxisrvl0ar3os">
+        <w:r>
+          <w:rPr>
+            <w:rStyle w:val="Hyperlink"/>
+            <w:b/>
+            <w:bCs/>
+          </w:rPr>
+          <w:t xml:space="preserve">ICD Việt Nam</w:t>
+        </w:r>
+      </w:hyperlink>
+      <w:r>
+        <w:rPr>
+          <w:b w:val="false"/>
+          <w:bCs w:val="false"/>
+        </w:rPr>
+        <w:t xml:space="preserve">, doanh nghiệp vật tư đóng gói công nghiệp.</w:t>
+      </w:r>
+    </w:p>
+    <w:p>
+      <w:pPr>
+        <w:spacing w:after="200"/>
+        <w:jc w:val="both"/>
+      </w:pPr>
+      <w:r>
+        <w:rPr>
+          <w:b w:val="false"/>
+          <w:bCs w:val="false"/>
+        </w:rPr>
+        <w:t xml:space="preserve">Ông Lê Văn Thăng, Giám đốc ICD Việt Nam, cho biết trước đây doanh nghiệp từng tự liên hệ một vài đầu báo nhưng không duy trì được đều đặn vì thiếu nhân sự.</w:t>
+      </w:r>
+    </w:p>
+    <w:p>
+      <w:pPr>
         <w:spacing w:after="200"/>
         <w:jc w:val="both"/>
       </w:pPr>
@@ -504,6 +530,19 @@
           <w:bCs w:val="false"/>
         </w:rPr>
         <w:t xml:space="preserve">Cũng cần làm rõ liệu chi phí có bao gồm cả phần theo dõi, tổng hợp kết quả, hay chỉ đơn thuần là phí đăng bài.</w:t>
+      </w:r>
+    </w:p>
+    <w:p>
+      <w:pPr>
+        <w:spacing w:after="200"/>
+        <w:jc w:val="both"/>
+      </w:pPr>
+      <w:r>
+        <w:rPr>
+          <w:b w:val="false"/>
+          <w:bCs w:val="false"/>
+        </w:rPr>
+        <w:t xml:space="preserve">Doanh nghiệp có nhu cầu liên hệ book báo tại khu vực miền Trung có thể tìm hiểu trực tiếp dịch vụ của DigicomVN để được tư vấn đầu báo phù hợp.</w:t>
       </w:r>
     </w:p>
     <w:p>

</xml_diff>

<commit_message>
auto: session 2026-07-11 13:41
Co-Authored-By: Claude Opus 4.8 (1M context) <noreply@anthropic.com>
</commit_message>
<xml_diff>
--- a/bai-pr/2026/07/02-baodanang-xu-huong-ai-dich-vu-so.docx
+++ b/bai-pr/2026/07/02-baodanang-xu-huong-ai-dich-vu-so.docx
@@ -7,7 +7,7 @@
         <w:pStyle w:val="Heading1"/>
       </w:pPr>
       <w:r>
-        <w:t xml:space="preserve">DigicomVN giải thích book báo là gì và cách chọn agency book báo phù hợp</w:t>
+        <w:t xml:space="preserve">DigicomVN gợi ý 5 tiêu chí chọn agency booking báo chí cho doanh nghiệp Đà Nẵng</w:t>
       </w:r>
     </w:p>
     <w:p>
@@ -20,7 +20,7 @@
           <w:b/>
           <w:bCs/>
         </w:rPr>
-        <w:t xml:space="preserve">Nhiều doanh nghiệp tra cứu “book báo là gì”, “giá book báo” hay “agency book báo” nhưng chưa rõ nên bắt đầu từ đâu. DigicomVN giải thích quy trình book báo chí và chia sẻ kinh nghiệm chọn agency phù hợp, dựa trên câu chuyện thực tế của ICD Việt Nam.</w:t>
+        <w:t xml:space="preserve">Doanh nghiệp Đà Nẵng muốn book báo chí nhưng chưa biết chọn agency nào phù hợp? DigicomVN gợi ý 5 tiêu chí cần kiểm tra trước khi ký hợp đồng, từ danh sách đầu báo hợp tác đến cách tính chi phí minh bạch, dựa trên kinh nghiệm triển khai cho ICD Việt Nam.</w:t>
       </w:r>
     </w:p>
     <w:p>
@@ -94,221 +94,35 @@
           <w:b w:val="false"/>
           <w:bCs w:val="false"/>
         </w:rPr>
-        <w:t xml:space="preserve">“Book báo” là cách gọi phổ biến trong giới marketing cho việc đặt lịch đăng bài PR trên báo điện tử.</w:t>
-      </w:r>
-    </w:p>
-    <w:p>
-      <w:pPr>
-        <w:spacing w:after="200"/>
-        <w:jc w:val="both"/>
-      </w:pPr>
-      <w:r>
-        <w:rPr>
-          <w:b w:val="false"/>
-          <w:bCs w:val="false"/>
-        </w:rPr>
-        <w:t xml:space="preserve">Thuật ngữ chính thức là booking báo chí, nhưng phần lớn doanh nghiệp tìm kiếm bằng cụm “book báo” hoặc “book báo chí” khi cần dịch vụ này.</w:t>
-      </w:r>
-    </w:p>
-    <w:p>
-      <w:pPr>
-        <w:pStyle w:val="Heading2"/>
-      </w:pPr>
-      <w:r>
-        <w:t xml:space="preserve">Book báo là gì</w:t>
-      </w:r>
-    </w:p>
-    <w:p>
-      <w:pPr>
-        <w:spacing w:after="200"/>
-        <w:jc w:val="both"/>
-      </w:pPr>
-      <w:r>
-        <w:rPr>
-          <w:b w:val="false"/>
-          <w:bCs w:val="false"/>
-        </w:rPr>
-        <w:t xml:space="preserve">Một bài book báo thường gồm ba yếu tố: nội dung bài viết, đầu báo đăng tải, và vị trí hiển thị trên trang.</w:t>
-      </w:r>
-    </w:p>
-    <w:p>
-      <w:pPr>
-        <w:spacing w:after="200"/>
-        <w:jc w:val="both"/>
-      </w:pPr>
-      <w:r>
-        <w:rPr>
-          <w:b w:val="false"/>
-          <w:bCs w:val="false"/>
-        </w:rPr>
-        <w:t xml:space="preserve">Vì phần lớn bài được đăng trên báo điện tử, nhiều người cũng tìm kiếm bằng cụm “booking báo điện tử” hoặc “book báo điện tử” khi cần dịch vụ này.</w:t>
-      </w:r>
-    </w:p>
-    <w:p>
-      <w:pPr>
-        <w:spacing w:after="200"/>
-        <w:jc w:val="both"/>
-      </w:pPr>
-      <w:r>
-        <w:rPr>
-          <w:b w:val="false"/>
-          <w:bCs w:val="false"/>
-        </w:rPr>
-        <w:t xml:space="preserve">Ngoài ra còn có thời gian bài được lưu trên hệ thống báo đó, yếu tố ảnh hưởng trực tiếp đến hiệu quả lâu dài.</w:t>
-      </w:r>
-    </w:p>
-    <w:p>
-      <w:pPr>
-        <w:spacing w:after="200"/>
-        <w:jc w:val="both"/>
-      </w:pPr>
-      <w:r>
-        <w:rPr>
-          <w:b w:val="false"/>
-          <w:bCs w:val="false"/>
-        </w:rPr>
-        <w:t xml:space="preserve">Nhiều doanh nghiệp tại Đà Nẵng và khu vực miền Trung tìm đến dịch vụ book báo khi muốn thương hiệu xuất hiện trên báo chí uy tín nhưng không có đội ngũ quan hệ báo chí riêng.</w:t>
-      </w:r>
-    </w:p>
-    <w:p>
-      <w:pPr>
-        <w:spacing w:after="200"/>
-        <w:jc w:val="both"/>
-      </w:pPr>
-      <w:r>
-        <w:rPr>
-          <w:b w:val="false"/>
-          <w:bCs w:val="false"/>
-        </w:rPr>
-        <w:t xml:space="preserve">Theo báo cáo e-Conomy SEA 2025 do Google, Temasek và Bain &amp; Company công bố tháng 11/2025, có tới 81% người dùng tại Việt Nam tương tác với AI hằng ngày, mức cao nhất Đông Nam Á.</w:t>
-      </w:r>
-    </w:p>
-    <w:p>
-      <w:pPr>
-        <w:spacing w:after="200"/>
-        <w:jc w:val="both"/>
-      </w:pPr>
-      <w:r>
-        <w:rPr>
-          <w:b w:val="false"/>
-          <w:bCs w:val="false"/>
-        </w:rPr>
-        <w:t xml:space="preserve">Khi người dùng ngày càng hỏi trực tiếp ChatGPT hay Google AI Overview thay vì gõ từ khoá, việc thương hiệu được nhắc trên báo chí trở thành tín hiệu quan trọng để các công cụ này nhận diện doanh nghiệp.</w:t>
-      </w:r>
-    </w:p>
-    <w:p>
-      <w:pPr>
-        <w:pStyle w:val="Heading2"/>
-      </w:pPr>
-      <w:r>
-        <w:t xml:space="preserve">Giá book báo phụ thuộc vào điều gì</w:t>
-      </w:r>
-    </w:p>
-    <w:p>
-      <w:pPr>
-        <w:spacing w:after="200"/>
-        <w:jc w:val="both"/>
-      </w:pPr>
-      <w:r>
-        <w:rPr>
-          <w:b w:val="false"/>
-          <w:bCs w:val="false"/>
-        </w:rPr>
-        <w:t xml:space="preserve">Nhiều người tìm “giá book báo” hoặc “bảng giá book báo” với kỳ vọng có một mức giá cố định áp dụng cho mọi đầu báo.</w:t>
-      </w:r>
-    </w:p>
-    <w:p>
-      <w:pPr>
-        <w:spacing w:after="200"/>
-        <w:jc w:val="both"/>
-      </w:pPr>
-      <w:r>
-        <w:rPr>
-          <w:b w:val="false"/>
-          <w:bCs w:val="false"/>
-        </w:rPr>
-        <w:t xml:space="preserve">Trên thực tế, giá không cố định vì phụ thuộc vào lượng truy cập, vị trí chuyên mục và thời gian bài được giữ trên hệ thống của từng báo.</w:t>
-      </w:r>
-    </w:p>
-    <w:p>
-      <w:pPr>
-        <w:spacing w:after="200"/>
-        <w:jc w:val="both"/>
-      </w:pPr>
-      <w:r>
-        <w:rPr>
-          <w:b w:val="false"/>
-          <w:bCs w:val="false"/>
-        </w:rPr>
-        <w:t xml:space="preserve">Ngoài chi phí đăng bài, phần ít được nhắc đến là công sức duy trì quan hệ với từng đầu báo: liên hệ, gửi nội dung đúng định dạng, theo dõi lịch đăng.</w:t>
-      </w:r>
-    </w:p>
-    <w:p>
-      <w:pPr>
-        <w:spacing w:after="200"/>
-        <w:jc w:val="both"/>
-      </w:pPr>
-      <w:r>
-        <w:rPr>
-          <w:b w:val="false"/>
-          <w:bCs w:val="false"/>
-        </w:rPr>
-        <w:t xml:space="preserve">Đây là lý do nhiều doanh nghiệp sau một thời gian tự book báo nhận ra phần chi phí thực sự nằm ở nhân sự vận hành, không chỉ ở tiền trả cho tòa soạn.</w:t>
-      </w:r>
-    </w:p>
-    <w:p>
-      <w:pPr>
-        <w:pStyle w:val="Heading2"/>
-      </w:pPr>
-      <w:r>
-        <w:t xml:space="preserve">Tự làm hay thuê agency book báo</w:t>
-      </w:r>
-    </w:p>
-    <w:p>
-      <w:pPr>
-        <w:spacing w:after="200"/>
-        <w:jc w:val="both"/>
-      </w:pPr>
-      <w:r>
-        <w:rPr>
-          <w:b w:val="false"/>
-          <w:bCs w:val="false"/>
-        </w:rPr>
-        <w:t xml:space="preserve">Với doanh nghiệp chỉ cần đăng một vài bài, tự liên hệ trực tiếp từng báo vẫn khả thi.</w:t>
-      </w:r>
-    </w:p>
-    <w:p>
-      <w:pPr>
-        <w:spacing w:after="200"/>
-        <w:jc w:val="both"/>
-      </w:pPr>
-      <w:r>
-        <w:rPr>
-          <w:b w:val="false"/>
-          <w:bCs w:val="false"/>
-        </w:rPr>
-        <w:t xml:space="preserve">Nhưng khi cần duy trì tần suất đều đặn trên nhiều đầu báo, thuê một agency booking báo chí chuyên nghiệp thường tiết kiệm thời gian hơn.</w:t>
-      </w:r>
-    </w:p>
-    <w:p>
-      <w:pPr>
-        <w:spacing w:after="200"/>
-        <w:jc w:val="both"/>
-      </w:pPr>
-      <w:r>
-        <w:rPr>
-          <w:b w:val="false"/>
-          <w:bCs w:val="false"/>
-        </w:rPr>
-        <w:t xml:space="preserve">Một số doanh nghiệp cũng tìm “booking báo online” khi muốn đặt lịch đăng bài trực tuyến mà không cần làm việc trực tiếp với từng toà soạn.</w:t>
-      </w:r>
-    </w:p>
-    <w:p>
-      <w:pPr>
-        <w:spacing w:after="200"/>
-        <w:jc w:val="both"/>
-      </w:pPr>
-      <w:hyperlink w:history="1" r:id="rIdsny_qug9mve_ri5oiqtvk">
+        <w:t xml:space="preserve">Đà Nẵng và khu vực miền Trung đang có ngày càng nhiều doanh nghiệp khởi nghiệp trong sản xuất, dịch vụ và công nghệ, nhưng không phải ai cũng biết cách chọn một agency booking báo chí phù hợp.</w:t>
+      </w:r>
+    </w:p>
+    <w:p>
+      <w:pPr>
+        <w:spacing w:after="200"/>
+        <w:jc w:val="both"/>
+      </w:pPr>
+      <w:r>
+        <w:rPr>
+          <w:b w:val="false"/>
+          <w:bCs w:val="false"/>
+        </w:rPr>
+        <w:t xml:space="preserve">Thị trường dịch vụ book báo hiện có nhiều đơn vị cung cấp, từ freelancer nhận việc lẻ đến các công ty truyền thông chuyên nghiệp, khiến doanh nghiệp dễ bối rối khi lựa chọn.</w:t>
+      </w:r>
+    </w:p>
+    <w:p>
+      <w:pPr>
+        <w:spacing w:after="200"/>
+        <w:jc w:val="both"/>
+      </w:pPr>
+      <w:r>
+        <w:rPr>
+          <w:b w:val="false"/>
+          <w:bCs w:val="false"/>
+        </w:rPr>
+        <w:t xml:space="preserve">Dưới đây là 5 tiêu chí </w:t>
+      </w:r>
+      <w:hyperlink w:history="1" r:id="rIdynav0uba3kmpsk4rpssvz">
         <w:r>
           <w:rPr>
             <w:rStyle w:val="Hyperlink"/>
@@ -323,7 +137,7 @@
           <w:b w:val="false"/>
           <w:bCs w:val="false"/>
         </w:rPr>
-        <w:t xml:space="preserve"> là một trong những đơn vị cung cấp dịch vụ book báo chí và PR tại Việt Nam, kết hợp automation ứng dụng AI để giảm bớt phần việc thủ công cho khách hàng.</w:t>
+        <w:t xml:space="preserve"> gợi ý doanh nghiệp Đà Nẵng nên cân nhắc trước khi ký hợp đồng với bất kỳ agency booking báo chí nào.</w:t>
       </w:r>
     </w:p>
     <w:p>
@@ -331,33 +145,213 @@
         <w:pStyle w:val="Heading2"/>
       </w:pPr>
       <w:r>
-        <w:t xml:space="preserve">Cách DigicomVN ứng dụng AI vào book báo</w:t>
-      </w:r>
-    </w:p>
-    <w:p>
-      <w:pPr>
-        <w:spacing w:after="200"/>
-        <w:jc w:val="both"/>
-      </w:pPr>
-      <w:r>
-        <w:rPr>
-          <w:b w:val="false"/>
-          <w:bCs w:val="false"/>
-        </w:rPr>
-        <w:t xml:space="preserve">Ông Đỗ Xuân Hiếu, Giám đốc DigicomVN (CÔNG TY TNHH DỊCH VỤ TRUYỀN THÔNG DIGITO COMBAT), cho biết hệ thống automation của công ty hỗ trợ lên lịch book báo, theo dõi tiến độ đăng bài và tổng hợp báo cáo hiệu quả tự động.</w:t>
-      </w:r>
-    </w:p>
-    <w:p>
-      <w:pPr>
-        <w:spacing w:after="200"/>
-        <w:jc w:val="both"/>
-      </w:pPr>
-      <w:r>
-        <w:rPr>
-          <w:b w:val="false"/>
-          <w:bCs w:val="false"/>
-        </w:rPr>
-        <w:t xml:space="preserve">Theo ông, một chiến dịch book báo hiệu quả không nằm ở số lượng bài đăng, mà ở việc chọn đúng đầu báo phù hợp với ngành hàng và duy trì tần suất đều đặn theo thời gian.</w:t>
+        <w:t xml:space="preserve">Tiêu chí 1: Danh sách đầu báo hợp tác rõ ràng</w:t>
+      </w:r>
+    </w:p>
+    <w:p>
+      <w:pPr>
+        <w:spacing w:after="200"/>
+        <w:jc w:val="both"/>
+      </w:pPr>
+      <w:r>
+        <w:rPr>
+          <w:b w:val="false"/>
+          <w:bCs w:val="false"/>
+        </w:rPr>
+        <w:t xml:space="preserve">Một agency booking báo chí uy tín cần công khai được danh sách đầu báo đang hợp tác thực tế, thay vì chỉ hứa hẹn chung chung “có quan hệ với nhiều báo lớn”.</w:t>
+      </w:r>
+    </w:p>
+    <w:p>
+      <w:pPr>
+        <w:spacing w:after="200"/>
+        <w:jc w:val="both"/>
+      </w:pPr>
+      <w:r>
+        <w:rPr>
+          <w:b w:val="false"/>
+          <w:bCs w:val="false"/>
+        </w:rPr>
+        <w:t xml:space="preserve">Doanh nghiệp nên yêu cầu xem ví dụ bài đã đăng trước đó trên chính các đầu báo mà agency giới thiệu.</w:t>
+      </w:r>
+    </w:p>
+    <w:p>
+      <w:pPr>
+        <w:pStyle w:val="Heading2"/>
+      </w:pPr>
+      <w:r>
+        <w:t xml:space="preserve">Tiêu chí 2: Báo cáo cụ thể sau mỗi đợt book báo</w:t>
+      </w:r>
+    </w:p>
+    <w:p>
+      <w:pPr>
+        <w:spacing w:after="200"/>
+        <w:jc w:val="both"/>
+      </w:pPr>
+      <w:r>
+        <w:rPr>
+          <w:b w:val="false"/>
+          <w:bCs w:val="false"/>
+        </w:rPr>
+        <w:t xml:space="preserve">Sau mỗi đợt booking báo chí, agency cần cung cấp báo cáo cụ thể: bài đăng ở đâu, thời điểm nào, kèm đường link trực tiếp để doanh nghiệp kiểm chứng.</w:t>
+      </w:r>
+    </w:p>
+    <w:p>
+      <w:pPr>
+        <w:spacing w:after="200"/>
+        <w:jc w:val="both"/>
+      </w:pPr>
+      <w:r>
+        <w:rPr>
+          <w:b w:val="false"/>
+          <w:bCs w:val="false"/>
+        </w:rPr>
+        <w:t xml:space="preserve">Nếu chỉ nhận được báo cáo chung chung kiểu “đã đăng thành công”, doanh nghiệp khó biết được hiệu quả thực sự của khoản chi phí đã bỏ ra.</w:t>
+      </w:r>
+    </w:p>
+    <w:p>
+      <w:pPr>
+        <w:pStyle w:val="Heading2"/>
+      </w:pPr>
+      <w:r>
+        <w:t xml:space="preserve">Tiêu chí 3: Hiểu đúng ngành hàng để chọn đầu báo phù hợp</w:t>
+      </w:r>
+    </w:p>
+    <w:p>
+      <w:pPr>
+        <w:spacing w:after="200"/>
+        <w:jc w:val="both"/>
+      </w:pPr>
+      <w:r>
+        <w:rPr>
+          <w:b w:val="false"/>
+          <w:bCs w:val="false"/>
+        </w:rPr>
+        <w:t xml:space="preserve">Một bài book báo chỉ hiệu quả khi được đăng đúng đầu báo, đúng chuyên mục mà nhóm khách hàng mục tiêu thường đọc.</w:t>
+      </w:r>
+    </w:p>
+    <w:p>
+      <w:pPr>
+        <w:spacing w:after="200"/>
+        <w:jc w:val="both"/>
+      </w:pPr>
+      <w:r>
+        <w:rPr>
+          <w:b w:val="false"/>
+          <w:bCs w:val="false"/>
+        </w:rPr>
+        <w:t xml:space="preserve">Agency hiểu ngành hàng của khách sẽ tư vấn được đầu báo phù hợp, thay vì đề xuất đăng tràn lan trên nhiều báo không liên quan chỉ để đủ số lượng.</w:t>
+      </w:r>
+    </w:p>
+    <w:p>
+      <w:pPr>
+        <w:pStyle w:val="Heading2"/>
+      </w:pPr>
+      <w:r>
+        <w:t xml:space="preserve">Tiêu chí 4: Có ứng dụng automation để duy trì tần suất</w:t>
+      </w:r>
+    </w:p>
+    <w:p>
+      <w:pPr>
+        <w:spacing w:after="200"/>
+        <w:jc w:val="both"/>
+      </w:pPr>
+      <w:r>
+        <w:rPr>
+          <w:b w:val="false"/>
+          <w:bCs w:val="false"/>
+        </w:rPr>
+        <w:t xml:space="preserve">Theo ước tính của McKinsey, việc ứng dụng AI vào tự động hoá quy trình thủ công có thể giúp doanh nghiệp tiết kiệm trung bình 30 đến 40% chi phí vận hành.</w:t>
+      </w:r>
+    </w:p>
+    <w:p>
+      <w:pPr>
+        <w:spacing w:after="200"/>
+        <w:jc w:val="both"/>
+      </w:pPr>
+      <w:r>
+        <w:rPr>
+          <w:b w:val="false"/>
+          <w:bCs w:val="false"/>
+        </w:rPr>
+        <w:t xml:space="preserve">Với dịch vụ book báo, automation giúp duy trì lịch đăng đều đặn, theo dõi tiến độ và tổng hợp báo cáo mà không cần nhân sự xử lý thủ công từng bước, đây là điểm nên hỏi rõ khi làm việc với agency.</w:t>
+      </w:r>
+    </w:p>
+    <w:p>
+      <w:pPr>
+        <w:pStyle w:val="Heading2"/>
+      </w:pPr>
+      <w:r>
+        <w:t xml:space="preserve">Tiêu chí 5: Chi phí minh bạch, không chỉ là giá đăng bài</w:t>
+      </w:r>
+    </w:p>
+    <w:p>
+      <w:pPr>
+        <w:spacing w:after="200"/>
+        <w:jc w:val="both"/>
+      </w:pPr>
+      <w:r>
+        <w:rPr>
+          <w:b w:val="false"/>
+          <w:bCs w:val="false"/>
+        </w:rPr>
+        <w:t xml:space="preserve">Giá book báo không nên chỉ gồm phí đăng bài, mà cần được giải thích rõ các khoản đi kèm như công liên hệ, biên tập nội dung và theo dõi hiệu quả.</w:t>
+      </w:r>
+    </w:p>
+    <w:p>
+      <w:pPr>
+        <w:spacing w:after="200"/>
+        <w:jc w:val="both"/>
+      </w:pPr>
+      <w:r>
+        <w:rPr>
+          <w:b w:val="false"/>
+          <w:bCs w:val="false"/>
+        </w:rPr>
+        <w:t xml:space="preserve">Doanh nghiệp nên chủ động hỏi agency về cách tính giá book báo trước khi ký hợp đồng, để tránh phát sinh chi phí ngoài dự kiến.</w:t>
+      </w:r>
+    </w:p>
+    <w:p>
+      <w:pPr>
+        <w:pStyle w:val="Heading2"/>
+      </w:pPr>
+      <w:r>
+        <w:t xml:space="preserve">DigicomVN và cách đáp ứng các tiêu chí trên</w:t>
+      </w:r>
+    </w:p>
+    <w:p>
+      <w:pPr>
+        <w:spacing w:after="200"/>
+        <w:jc w:val="both"/>
+      </w:pPr>
+      <w:hyperlink w:history="1" r:id="rIdyjklokjgugqkb81n7psns">
+        <w:r>
+          <w:rPr>
+            <w:rStyle w:val="Hyperlink"/>
+            <w:b/>
+            <w:bCs/>
+          </w:rPr>
+          <w:t xml:space="preserve">DigicomVN</w:t>
+        </w:r>
+      </w:hyperlink>
+      <w:r>
+        <w:rPr>
+          <w:b w:val="false"/>
+          <w:bCs w:val="false"/>
+        </w:rPr>
+        <w:t xml:space="preserve"> là một agency booking báo chí tại Việt Nam, xây dựng quy trình dựa trên các tiêu chí kể trên: minh bạch đầu báo, báo cáo cụ thể, và ứng dụng automation AI xuyên suốt.</w:t>
+      </w:r>
+    </w:p>
+    <w:p>
+      <w:pPr>
+        <w:spacing w:after="200"/>
+        <w:jc w:val="both"/>
+      </w:pPr>
+      <w:r>
+        <w:rPr>
+          <w:b w:val="false"/>
+          <w:bCs w:val="false"/>
+        </w:rPr>
+        <w:t xml:space="preserve">Ông Đỗ Xuân Hiếu, Giám đốc DigicomVN (CÔNG TY TNHH DỊCH VỤ TRUYỀN THÔNG DIGITO COMBAT), người có gần 15 năm kinh nghiệm trong lĩnh vực truyền thông và marketing, cho biết đội ngũ luôn tư vấn đầu báo phù hợp trước khi triển khai, thay vì nhận mọi yêu cầu book báo mà không cân nhắc phù hợp ngành hàng.</w:t>
       </w:r>
     </w:p>
     <w:p>
@@ -426,22 +420,22 @@
         <w:pStyle w:val="Heading2"/>
       </w:pPr>
       <w:r>
-        <w:t xml:space="preserve">Câu chuyện thực tế: ICD Việt Nam</w:t>
-      </w:r>
-    </w:p>
-    <w:p>
-      <w:pPr>
-        <w:spacing w:after="200"/>
-        <w:jc w:val="both"/>
-      </w:pPr>
-      <w:r>
-        <w:rPr>
-          <w:b w:val="false"/>
-          <w:bCs w:val="false"/>
-        </w:rPr>
-        <w:t xml:space="preserve">Một khách hàng đang sử dụng dịch vụ book báo của DigicomVN là </w:t>
-      </w:r>
-      <w:hyperlink w:history="1" r:id="rIdspag0md6bxisrvl0ar3os">
+        <w:t xml:space="preserve">Khách hàng thực tế: ICD Việt Nam</w:t>
+      </w:r>
+    </w:p>
+    <w:p>
+      <w:pPr>
+        <w:spacing w:after="200"/>
+        <w:jc w:val="both"/>
+      </w:pPr>
+      <w:r>
+        <w:rPr>
+          <w:b w:val="false"/>
+          <w:bCs w:val="false"/>
+        </w:rPr>
+        <w:t xml:space="preserve">Một khách hàng đang sử dụng dịch vụ của DigicomVN là </w:t>
+      </w:r>
+      <w:hyperlink w:history="1" r:id="rId-ndqdduao4jqzcae43zf6">
         <w:r>
           <w:rPr>
             <w:rStyle w:val="Hyperlink"/>
@@ -469,20 +463,7 @@
           <w:b w:val="false"/>
           <w:bCs w:val="false"/>
         </w:rPr>
-        <w:t xml:space="preserve">Ông Lê Văn Thăng, Giám đốc ICD Việt Nam, cho biết trước đây doanh nghiệp từng tự liên hệ một vài đầu báo nhưng không duy trì được đều đặn vì thiếu nhân sự.</w:t>
-      </w:r>
-    </w:p>
-    <w:p>
-      <w:pPr>
-        <w:spacing w:after="200"/>
-        <w:jc w:val="both"/>
-      </w:pPr>
-      <w:r>
-        <w:rPr>
-          <w:b w:val="false"/>
-          <w:bCs w:val="false"/>
-        </w:rPr>
-        <w:t xml:space="preserve">Từ khi sử dụng dịch vụ của DigicomVN, lịch book báo được theo dõi tự động và ông nhận báo cáo cụ thể sau mỗi đợt đăng bài.</w:t>
+        <w:t xml:space="preserve">Ông Lê Văn Thăng, Giám đốc ICD Việt Nam, cho biết điều khiến doanh nghiệp yên tâm hợp tác lâu dài là báo cáo cụ thể sau mỗi đợt booking báo chí, kèm danh sách đầu báo và thời điểm đăng rõ ràng.</w:t>
       </w:r>
     </w:p>
     <w:p>
@@ -490,72 +471,46 @@
         <w:pStyle w:val="Heading2"/>
       </w:pPr>
       <w:r>
-        <w:t xml:space="preserve">Lưu ý khi chọn agency book báo</w:t>
-      </w:r>
-    </w:p>
-    <w:p>
-      <w:pPr>
-        <w:spacing w:after="200"/>
-        <w:jc w:val="both"/>
-      </w:pPr>
-      <w:r>
-        <w:rPr>
-          <w:b w:val="false"/>
-          <w:bCs w:val="false"/>
-        </w:rPr>
-        <w:t xml:space="preserve">Đà Nẵng và khu vực miền Trung có nhiều doanh nghiệp khởi nghiệp trong sản xuất, dịch vụ và công nghệ, nhưng phần lớn chưa có đội ngũ marketing đầy đủ.</w:t>
-      </w:r>
-    </w:p>
-    <w:p>
-      <w:pPr>
-        <w:spacing w:after="200"/>
-        <w:jc w:val="both"/>
-      </w:pPr>
-      <w:r>
-        <w:rPr>
-          <w:b w:val="false"/>
-          <w:bCs w:val="false"/>
-        </w:rPr>
-        <w:t xml:space="preserve">Theo ông Hiếu, khi chọn agency book báo, doanh nghiệp nên hỏi rõ danh sách đầu báo hợp tác thực tế và cách báo cáo hiệu quả sau mỗi đợt đăng.</w:t>
-      </w:r>
-    </w:p>
-    <w:p>
-      <w:pPr>
-        <w:spacing w:after="200"/>
-        <w:jc w:val="both"/>
-      </w:pPr>
-      <w:r>
-        <w:rPr>
-          <w:b w:val="false"/>
-          <w:bCs w:val="false"/>
-        </w:rPr>
-        <w:t xml:space="preserve">Cũng cần làm rõ liệu chi phí có bao gồm cả phần theo dõi, tổng hợp kết quả, hay chỉ đơn thuần là phí đăng bài.</w:t>
-      </w:r>
-    </w:p>
-    <w:p>
-      <w:pPr>
-        <w:spacing w:after="200"/>
-        <w:jc w:val="both"/>
-      </w:pPr>
-      <w:r>
-        <w:rPr>
-          <w:b w:val="false"/>
-          <w:bCs w:val="false"/>
-        </w:rPr>
-        <w:t xml:space="preserve">Doanh nghiệp có nhu cầu liên hệ book báo tại khu vực miền Trung có thể tìm hiểu trực tiếp dịch vụ của DigicomVN để được tư vấn đầu báo phù hợp.</w:t>
-      </w:r>
-    </w:p>
-    <w:p>
-      <w:pPr>
-        <w:spacing w:after="200"/>
-        <w:jc w:val="both"/>
-      </w:pPr>
-      <w:r>
-        <w:rPr>
-          <w:b w:val="false"/>
-          <w:bCs w:val="false"/>
-        </w:rPr>
-        <w:t xml:space="preserve">Với định hướng tập trung vào dịch vụ book báo chí và automation, DigicomVN đặt mục tiêu trở thành lựa chọn minh bạch cho doanh nghiệp nhỏ và vừa tại nhiều tỉnh thành, trong đó có khu vực miền Trung.</w:t>
+        <w:t xml:space="preserve">Cơ hội tại Đà Nẵng</w:t>
+      </w:r>
+    </w:p>
+    <w:p>
+      <w:pPr>
+        <w:spacing w:after="200"/>
+        <w:jc w:val="both"/>
+      </w:pPr>
+      <w:r>
+        <w:rPr>
+          <w:b w:val="false"/>
+          <w:bCs w:val="false"/>
+        </w:rPr>
+        <w:t xml:space="preserve">Đà Nẵng và khu vực miền Trung là nơi tập trung nhiều doanh nghiệp trẻ, cần xây dựng thương hiệu nhanh nhưng chưa có đội ngũ marketing đầy đủ để tự đánh giá agency phù hợp.</w:t>
+      </w:r>
+    </w:p>
+    <w:p>
+      <w:pPr>
+        <w:spacing w:after="200"/>
+        <w:jc w:val="both"/>
+      </w:pPr>
+      <w:r>
+        <w:rPr>
+          <w:b w:val="false"/>
+          <w:bCs w:val="false"/>
+        </w:rPr>
+        <w:t xml:space="preserve">DigicomVN cho biết sẵn sàng tư vấn quy trình book báo phù hợp cho doanh nghiệp tại khu vực này trước khi ký hợp đồng chính thức.</w:t>
+      </w:r>
+    </w:p>
+    <w:p>
+      <w:pPr>
+        <w:spacing w:after="200"/>
+        <w:jc w:val="both"/>
+      </w:pPr>
+      <w:r>
+        <w:rPr>
+          <w:b w:val="false"/>
+          <w:bCs w:val="false"/>
+        </w:rPr>
+        <w:t xml:space="preserve">Với 5 tiêu chí trên, doanh nghiệp có thể tự đánh giá agency booking báo chí phù hợp, thay vì chỉ dựa vào mức giá được chào.</w:t>
       </w:r>
     </w:p>
     <w:p>

</xml_diff>